<commit_message>
Add live Railway deployment (heart.jpailabs.tech) to README and report
</commit_message>
<xml_diff>
--- a/reports/MLOps_Assignment1_Report.docx
+++ b/reports/MLOps_Assignment1_Report.docx
@@ -198,28 +198,27 @@
           <w:bCs/>
           <w:b/>
         </w:rPr>
-        <w:t xml:space="preserve">API access:</w:t>
-      </w:r>
-      <w:r>
-        <w:t xml:space="preserve"> </w:t>
-      </w:r>
-      <w:r>
-        <w:t xml:space="preserve">see §8 (local Kubernetes via Ingress at</w:t>
-      </w:r>
-      <w:r>
-        <w:t xml:space="preserve"> </w:t>
-      </w:r>
-      <w:r>
-        <w:rPr>
-          <w:rStyle w:val="VerbatimChar"/>
-        </w:rPr>
-        <w:t xml:space="preserve">http://localhost:8088</w:t>
-      </w:r>
-      <w:r>
-        <w:t xml:space="preserve">)</w:t>
-      </w:r>
-    </w:p>
-    <w:bookmarkStart w:id="21" w:name="executive-summary"/>
+        <w:t xml:space="preserve">Live API &amp; web UI:</w:t>
+      </w:r>
+      <w:r>
+        <w:t xml:space="preserve"> </w:t>
+      </w:r>
+      <w:hyperlink r:id="rId21">
+        <w:r>
+          <w:rPr>
+            <w:rStyle w:val="Hyperlink"/>
+          </w:rPr>
+          <w:t xml:space="preserve">https://heart.jpailabs.tech</w:t>
+        </w:r>
+      </w:hyperlink>
+      <w:r>
+        <w:t xml:space="preserve"> </w:t>
+      </w:r>
+      <w:r>
+        <w:t xml:space="preserve">(Railway) · local Kubernetes access in §10</w:t>
+      </w:r>
+    </w:p>
+    <w:bookmarkStart w:id="22" w:name="executive-summary"/>
     <w:p>
       <w:pPr>
         <w:pStyle w:val="Heading1"/>
@@ -592,7 +591,7 @@
               <w:jc w:val="left"/>
             </w:pPr>
             <w:r>
-              <w:t xml:space="preserve">kind Kubernetes cluster: 2 replicas, probes, PDB, Ingress (nginx) and a LoadBalancer service</w:t>
+              <w:t xml:space="preserve">kind Kubernetes cluster: 2 replicas, probes, PDB, Ingress (nginx) and a LoadBalancer service; public cloud deployment on Railway at https://heart.jpailabs.tech, with a web UI</w:t>
             </w:r>
           </w:p>
         </w:tc>
@@ -695,8 +694,8 @@
         <w:t xml:space="preserve">.</w:t>
       </w:r>
     </w:p>
-    <w:bookmarkEnd w:id="21"/>
-    <w:bookmarkStart w:id="23" w:name="architecture"/>
+    <w:bookmarkEnd w:id="22"/>
+    <w:bookmarkStart w:id="24" w:name="architecture"/>
     <w:p>
       <w:pPr>
         <w:pStyle w:val="Heading1"/>
@@ -725,7 +724,7 @@
                     </pic:cNvPicPr>
                   </pic:nvPicPr>
                   <pic:blipFill>
-                    <a:blip r:embed="rId22"/>
+                    <a:blip r:embed="rId23"/>
                     <a:stretch>
                       <a:fillRect/>
                     </a:stretch>
@@ -960,8 +959,8 @@
         <w:t xml:space="preserve">annotations, not the Service. Scraping through the Service would land on a random replica each time and give inconsistent counters.</w:t>
       </w:r>
     </w:p>
-    <w:bookmarkEnd w:id="23"/>
-    <w:bookmarkStart w:id="24" w:name="setup-and-installation"/>
+    <w:bookmarkEnd w:id="24"/>
+    <w:bookmarkStart w:id="25" w:name="setup-and-installation"/>
     <w:p>
       <w:pPr>
         <w:pStyle w:val="Heading1"/>
@@ -1363,8 +1362,8 @@
         <w:t xml:space="preserve">) gave identical metrics, because every random seed is fixed to 42.</w:t>
       </w:r>
     </w:p>
-    <w:bookmarkEnd w:id="24"/>
-    <w:bookmarkStart w:id="30" w:name="data-acquisition-and-eda"/>
+    <w:bookmarkEnd w:id="25"/>
+    <w:bookmarkStart w:id="31" w:name="data-acquisition-and-eda"/>
     <w:p>
       <w:pPr>
         <w:pStyle w:val="Heading1"/>
@@ -1640,7 +1639,7 @@
                     </pic:cNvPicPr>
                   </pic:nvPicPr>
                   <pic:blipFill>
-                    <a:blip r:embed="rId25"/>
+                    <a:blip r:embed="rId26"/>
                     <a:stretch>
                       <a:fillRect/>
                     </a:stretch>
@@ -1685,7 +1684,7 @@
                     </pic:cNvPicPr>
                   </pic:nvPicPr>
                   <pic:blipFill>
-                    <a:blip r:embed="rId26"/>
+                    <a:blip r:embed="rId27"/>
                     <a:stretch>
                       <a:fillRect/>
                     </a:stretch>
@@ -1755,7 +1754,7 @@
                     </pic:cNvPicPr>
                   </pic:nvPicPr>
                   <pic:blipFill>
-                    <a:blip r:embed="rId27"/>
+                    <a:blip r:embed="rId28"/>
                     <a:stretch>
                       <a:fillRect/>
                     </a:stretch>
@@ -1810,7 +1809,7 @@
                     </pic:cNvPicPr>
                   </pic:nvPicPr>
                   <pic:blipFill>
-                    <a:blip r:embed="rId28"/>
+                    <a:blip r:embed="rId29"/>
                     <a:stretch>
                       <a:fillRect/>
                     </a:stretch>
@@ -1865,7 +1864,7 @@
                     </pic:cNvPicPr>
                   </pic:nvPicPr>
                   <pic:blipFill>
-                    <a:blip r:embed="rId29"/>
+                    <a:blip r:embed="rId30"/>
                     <a:stretch>
                       <a:fillRect/>
                     </a:stretch>
@@ -2140,8 +2139,8 @@
         <w:t xml:space="preserve">The box plots show a few high cholesterol values (up to 564 mg/dl). They are clinically plausible, so they are kept, and standard scaling limits their influence on the linear model.</w:t>
       </w:r>
     </w:p>
-    <w:bookmarkEnd w:id="30"/>
-    <w:bookmarkStart w:id="36" w:name="Xa799d93673afa10bf90c9043574061a98caadb1"/>
+    <w:bookmarkEnd w:id="31"/>
+    <w:bookmarkStart w:id="37" w:name="Xa799d93673afa10bf90c9043574061a98caadb1"/>
     <w:p>
       <w:pPr>
         <w:pStyle w:val="Heading1"/>
@@ -3306,7 +3305,7 @@
                     </pic:cNvPicPr>
                   </pic:nvPicPr>
                   <pic:blipFill>
-                    <a:blip r:embed="rId31"/>
+                    <a:blip r:embed="rId32"/>
                     <a:stretch>
                       <a:fillRect/>
                     </a:stretch>
@@ -3356,51 +3355,6 @@
                 <pic:pic>
                   <pic:nvPicPr>
                     <pic:cNvPr descr="figures/logistic_regression_roc_curve.png" id="0" name="Picture"/>
-                    <pic:cNvPicPr>
-                      <a:picLocks noChangeArrowheads="1" noChangeAspect="1"/>
-                    </pic:cNvPicPr>
-                  </pic:nvPicPr>
-                  <pic:blipFill>
-                    <a:blip r:embed="rId32"/>
-                    <a:stretch>
-                      <a:fillRect/>
-                    </a:stretch>
-                  </pic:blipFill>
-                  <pic:spPr bwMode="auto">
-                    <a:xfrm>
-                      <a:off x="0" y="0"/>
-                      <a:ext cx="4146697" cy="3685953"/>
-                    </a:xfrm>
-                    <a:prstGeom prst="rect">
-                      <a:avLst/>
-                    </a:prstGeom>
-                    <a:noFill/>
-                    <a:ln w="9525">
-                      <a:noFill/>
-                      <a:headEnd/>
-                      <a:tailEnd/>
-                    </a:ln>
-                  </pic:spPr>
-                </pic:pic>
-              </a:graphicData>
-            </a:graphic>
-          </wp:inline>
-        </w:drawing>
-      </w:r>
-      <w:r>
-        <w:t xml:space="preserve"> </w:t>
-      </w:r>
-      <w:r>
-        <w:drawing>
-          <wp:inline>
-            <wp:extent cx="4146697" cy="3685953"/>
-            <wp:effectExtent b="0" l="0" r="0" t="0"/>
-            <wp:docPr descr="Confusion matrix (LogReg)" title="" id="1" name="Picture"/>
-            <a:graphic>
-              <a:graphicData uri="http://schemas.openxmlformats.org/drawingml/2006/picture">
-                <pic:pic>
-                  <pic:nvPicPr>
-                    <pic:cNvPr descr="figures/logistic_regression_confusion_matrix.png" id="0" name="Picture"/>
                     <pic:cNvPicPr>
                       <a:picLocks noChangeArrowheads="1" noChangeAspect="1"/>
                     </pic:cNvPicPr>
@@ -3440,12 +3394,12 @@
           <wp:inline>
             <wp:extent cx="4146697" cy="3685953"/>
             <wp:effectExtent b="0" l="0" r="0" t="0"/>
-            <wp:docPr descr="ROC (RF)" title="" id="1" name="Picture"/>
+            <wp:docPr descr="Confusion matrix (LogReg)" title="" id="1" name="Picture"/>
             <a:graphic>
               <a:graphicData uri="http://schemas.openxmlformats.org/drawingml/2006/picture">
                 <pic:pic>
                   <pic:nvPicPr>
-                    <pic:cNvPr descr="figures/random_forest_roc_curve.png" id="0" name="Picture"/>
+                    <pic:cNvPr descr="figures/logistic_regression_confusion_matrix.png" id="0" name="Picture"/>
                     <pic:cNvPicPr>
                       <a:picLocks noChangeArrowheads="1" noChangeAspect="1"/>
                     </pic:cNvPicPr>
@@ -3477,6 +3431,51 @@
           </wp:inline>
         </w:drawing>
       </w:r>
+      <w:r>
+        <w:t xml:space="preserve"> </w:t>
+      </w:r>
+      <w:r>
+        <w:drawing>
+          <wp:inline>
+            <wp:extent cx="4146697" cy="3685953"/>
+            <wp:effectExtent b="0" l="0" r="0" t="0"/>
+            <wp:docPr descr="ROC (RF)" title="" id="1" name="Picture"/>
+            <a:graphic>
+              <a:graphicData uri="http://schemas.openxmlformats.org/drawingml/2006/picture">
+                <pic:pic>
+                  <pic:nvPicPr>
+                    <pic:cNvPr descr="figures/random_forest_roc_curve.png" id="0" name="Picture"/>
+                    <pic:cNvPicPr>
+                      <a:picLocks noChangeArrowheads="1" noChangeAspect="1"/>
+                    </pic:cNvPicPr>
+                  </pic:nvPicPr>
+                  <pic:blipFill>
+                    <a:blip r:embed="rId35"/>
+                    <a:stretch>
+                      <a:fillRect/>
+                    </a:stretch>
+                  </pic:blipFill>
+                  <pic:spPr bwMode="auto">
+                    <a:xfrm>
+                      <a:off x="0" y="0"/>
+                      <a:ext cx="4146697" cy="3685953"/>
+                    </a:xfrm>
+                    <a:prstGeom prst="rect">
+                      <a:avLst/>
+                    </a:prstGeom>
+                    <a:noFill/>
+                    <a:ln w="9525">
+                      <a:noFill/>
+                      <a:headEnd/>
+                      <a:tailEnd/>
+                    </a:ln>
+                  </pic:spPr>
+                </pic:pic>
+              </a:graphicData>
+            </a:graphic>
+          </wp:inline>
+        </w:drawing>
+      </w:r>
     </w:p>
     <w:p>
       <w:pPr>
@@ -3498,7 +3497,7 @@
                     </pic:cNvPicPr>
                   </pic:nvPicPr>
                   <pic:blipFill>
-                    <a:blip r:embed="rId35"/>
+                    <a:blip r:embed="rId36"/>
                     <a:stretch>
                       <a:fillRect/>
                     </a:stretch>
@@ -3630,8 +3629,8 @@
         <w:t xml:space="preserve">, which matches the EDA.</w:t>
       </w:r>
     </w:p>
-    <w:bookmarkEnd w:id="36"/>
-    <w:bookmarkStart w:id="39" w:name="experiment-tracking-mlflow"/>
+    <w:bookmarkEnd w:id="37"/>
+    <w:bookmarkStart w:id="40" w:name="experiment-tracking-mlflow"/>
     <w:p>
       <w:pPr>
         <w:pStyle w:val="Heading1"/>
@@ -3980,7 +3979,7 @@
                     </pic:cNvPicPr>
                   </pic:nvPicPr>
                   <pic:blipFill>
-                    <a:blip r:embed="rId37"/>
+                    <a:blip r:embed="rId38"/>
                     <a:stretch>
                       <a:fillRect/>
                     </a:stretch>
@@ -4035,7 +4034,7 @@
                     </pic:cNvPicPr>
                   </pic:nvPicPr>
                   <pic:blipFill>
-                    <a:blip r:embed="rId38"/>
+                    <a:blip r:embed="rId39"/>
                     <a:stretch>
                       <a:fillRect/>
                     </a:stretch>
@@ -4070,8 +4069,8 @@
         <w:t xml:space="preserve">MLflow - selected run with params, metrics and registered model</w:t>
       </w:r>
     </w:p>
-    <w:bookmarkEnd w:id="39"/>
-    <w:bookmarkStart w:id="41" w:name="packaging-reproducibility-and-testing"/>
+    <w:bookmarkEnd w:id="40"/>
+    <w:bookmarkStart w:id="42" w:name="packaging-reproducibility-and-testing"/>
     <w:p>
       <w:pPr>
         <w:pStyle w:val="Heading1"/>
@@ -4376,7 +4375,7 @@
                     </pic:cNvPicPr>
                   </pic:nvPicPr>
                   <pic:blipFill>
-                    <a:blip r:embed="rId40"/>
+                    <a:blip r:embed="rId41"/>
                     <a:stretch>
                       <a:fillRect/>
                     </a:stretch>
@@ -4411,8 +4410,8 @@
         <w:t xml:space="preserve">pytest</w:t>
       </w:r>
     </w:p>
-    <w:bookmarkEnd w:id="41"/>
-    <w:bookmarkStart w:id="45" w:name="cicd-pipeline-github-actions"/>
+    <w:bookmarkEnd w:id="42"/>
+    <w:bookmarkStart w:id="46" w:name="cicd-pipeline-github-actions"/>
     <w:p>
       <w:pPr>
         <w:pStyle w:val="Heading1"/>
@@ -4837,7 +4836,7 @@
                     </pic:cNvPicPr>
                   </pic:nvPicPr>
                   <pic:blipFill>
-                    <a:blip r:embed="rId42"/>
+                    <a:blip r:embed="rId43"/>
                     <a:stretch>
                       <a:fillRect/>
                     </a:stretch>
@@ -4889,7 +4888,7 @@
       <w:r>
         <w:t xml:space="preserve">(</w:t>
       </w:r>
-      <w:hyperlink r:id="rId43">
+      <w:hyperlink r:id="rId44">
         <w:r>
           <w:rPr>
             <w:rStyle w:val="Hyperlink"/>
@@ -4921,7 +4920,7 @@
                     </pic:cNvPicPr>
                   </pic:nvPicPr>
                   <pic:blipFill>
-                    <a:blip r:embed="rId44"/>
+                    <a:blip r:embed="rId45"/>
                     <a:stretch>
                       <a:fillRect/>
                     </a:stretch>
@@ -4956,8 +4955,8 @@
         <w:t xml:space="preserve">GitHub Actions run - jobs, artifacts and quality gate</w:t>
       </w:r>
     </w:p>
-    <w:bookmarkEnd w:id="45"/>
-    <w:bookmarkStart w:id="48" w:name="containerisation-and-the-serving-api"/>
+    <w:bookmarkEnd w:id="46"/>
+    <w:bookmarkStart w:id="49" w:name="containerisation-and-the-serving-api"/>
     <w:p>
       <w:pPr>
         <w:pStyle w:val="Heading1"/>
@@ -5461,7 +5460,7 @@
                     </pic:cNvPicPr>
                   </pic:nvPicPr>
                   <pic:blipFill>
-                    <a:blip r:embed="rId46"/>
+                    <a:blip r:embed="rId47"/>
                     <a:stretch>
                       <a:fillRect/>
                     </a:stretch>
@@ -5516,7 +5515,7 @@
                     </pic:cNvPicPr>
                   </pic:nvPicPr>
                   <pic:blipFill>
-                    <a:blip r:embed="rId47"/>
+                    <a:blip r:embed="rId48"/>
                     <a:stretch>
                       <a:fillRect/>
                     </a:stretch>
@@ -5551,8 +5550,8 @@
         <w:t xml:space="preserve">Swagger UI</w:t>
       </w:r>
     </w:p>
-    <w:bookmarkEnd w:id="48"/>
-    <w:bookmarkStart w:id="51" w:name="production-deployment-kubernetes"/>
+    <w:bookmarkEnd w:id="49"/>
+    <w:bookmarkStart w:id="56" w:name="production-deployment-kubernetes"/>
     <w:p>
       <w:pPr>
         <w:pStyle w:val="Heading1"/>
@@ -5879,7 +5878,7 @@
                     </pic:cNvPicPr>
                   </pic:nvPicPr>
                   <pic:blipFill>
-                    <a:blip r:embed="rId49"/>
+                    <a:blip r:embed="rId50"/>
                     <a:stretch>
                       <a:fillRect/>
                     </a:stretch>
@@ -5934,7 +5933,7 @@
                     </pic:cNvPicPr>
                   </pic:nvPicPr>
                   <pic:blipFill>
-                    <a:blip r:embed="rId50"/>
+                    <a:blip r:embed="rId51"/>
                     <a:stretch>
                       <a:fillRect/>
                     </a:stretch>
@@ -6084,14 +6083,50 @@
         <w:t xml:space="preserve">.</w:t>
       </w:r>
     </w:p>
-    <w:bookmarkEnd w:id="51"/>
-    <w:bookmarkStart w:id="55" w:name="monitoring-and-logging"/>
-    <w:p>
-      <w:pPr>
-        <w:pStyle w:val="Heading1"/>
-      </w:pPr>
-      <w:r>
-        <w:t xml:space="preserve">11. Monitoring and logging</w:t>
+    <w:bookmarkStart w:id="55" w:name="public-cloud-deployment-railway"/>
+    <w:p>
+      <w:pPr>
+        <w:pStyle w:val="Heading2"/>
+      </w:pPr>
+      <w:r>
+        <w:t xml:space="preserve">10.1 Public cloud deployment: Railway</w:t>
+      </w:r>
+    </w:p>
+    <w:p>
+      <w:pPr>
+        <w:pStyle w:val="FirstParagraph"/>
+      </w:pPr>
+      <w:r>
+        <w:t xml:space="preserve">Kubernetes is the main deployment target. The same model and API, packaged with an added web UI, also run on</w:t>
+      </w:r>
+      <w:r>
+        <w:t xml:space="preserve"> </w:t>
+      </w:r>
+      <w:r>
+        <w:rPr>
+          <w:bCs/>
+          <w:b/>
+        </w:rPr>
+        <w:t xml:space="preserve">Railway</w:t>
+      </w:r>
+      <w:r>
+        <w:t xml:space="preserve">, which provides a public, HTTPS-secured endpoint at</w:t>
+      </w:r>
+      <w:r>
+        <w:t xml:space="preserve"> </w:t>
+      </w:r>
+      <w:hyperlink r:id="rId21">
+        <w:r>
+          <w:rPr>
+            <w:rStyle w:val="Hyperlink"/>
+            <w:bCs/>
+            <w:b/>
+          </w:rPr>
+          <w:t xml:space="preserve">https://heart.jpailabs.tech</w:t>
+        </w:r>
+      </w:hyperlink>
+      <w:r>
+        <w:t xml:space="preserve">.</w:t>
       </w:r>
     </w:p>
     <w:p>
@@ -6107,52 +6142,78 @@
           <w:bCs/>
           <w:b/>
         </w:rPr>
-        <w:t xml:space="preserve">Request logging.</w:t>
-      </w:r>
-      <w:r>
-        <w:t xml:space="preserve"> </w:t>
-      </w:r>
-      <w:r>
-        <w:t xml:space="preserve">HTTP middleware writes one JSON line per request to stdout, with</w:t>
-      </w:r>
-      <w:r>
-        <w:t xml:space="preserve"> </w:t>
-      </w:r>
-      <w:r>
-        <w:rPr>
-          <w:rStyle w:val="VerbatimChar"/>
-        </w:rPr>
-        <w:t xml:space="preserve">request_id</w:t>
-      </w:r>
-      <w:r>
-        <w:t xml:space="preserve">, method, path, status, latency and client IP. The request id is also returned in the</w:t>
-      </w:r>
-      <w:r>
-        <w:t xml:space="preserve"> </w:t>
-      </w:r>
-      <w:r>
-        <w:rPr>
-          <w:rStyle w:val="VerbatimChar"/>
-        </w:rPr>
-        <w:t xml:space="preserve">x-request-id</w:t>
-      </w:r>
-      <w:r>
-        <w:t xml:space="preserve"> </w:t>
-      </w:r>
-      <w:r>
-        <w:t xml:space="preserve">header. Each prediction is logged with its input and output, which gives an audit trail and data for later drift analysis. Kubernetes collects these logs with</w:t>
-      </w:r>
-      <w:r>
-        <w:t xml:space="preserve"> </w:t>
-      </w:r>
-      <w:r>
-        <w:rPr>
-          <w:rStyle w:val="VerbatimChar"/>
-        </w:rPr>
-        <w:t xml:space="preserve">kubectl logs</w:t>
-      </w:r>
-      <w:r>
-        <w:t xml:space="preserve">.</w:t>
+        <w:t xml:space="preserve">Repository.</w:t>
+      </w:r>
+      <w:r>
+        <w:t xml:space="preserve"> </w:t>
+      </w:r>
+      <w:r>
+        <w:t xml:space="preserve">The deployment repo,</w:t>
+      </w:r>
+      <w:r>
+        <w:t xml:space="preserve"> </w:t>
+      </w:r>
+      <w:hyperlink r:id="rId52">
+        <w:r>
+          <w:rPr>
+            <w:rStyle w:val="Hyperlink"/>
+          </w:rPr>
+          <w:t xml:space="preserve">jpailabs/heart-disease-railway</w:t>
+        </w:r>
+      </w:hyperlink>
+      <w:r>
+        <w:t xml:space="preserve">, contains the serving code, the trained pipeline and a Railway configuration file (</w:t>
+      </w:r>
+      <w:r>
+        <w:rPr>
+          <w:rStyle w:val="VerbatimChar"/>
+        </w:rPr>
+        <w:t xml:space="preserve">railway.json</w:t>
+      </w:r>
+      <w:r>
+        <w:t xml:space="preserve">). That file sets the Dockerfile builder, a</w:t>
+      </w:r>
+      <w:r>
+        <w:t xml:space="preserve"> </w:t>
+      </w:r>
+      <w:r>
+        <w:rPr>
+          <w:rStyle w:val="VerbatimChar"/>
+        </w:rPr>
+        <w:t xml:space="preserve">/ready</w:t>
+      </w:r>
+      <w:r>
+        <w:t xml:space="preserve"> </w:t>
+      </w:r>
+      <w:r>
+        <w:t xml:space="preserve">healthcheck and restart-on-failure. Railway builds the image and redeploys it on every push to</w:t>
+      </w:r>
+      <w:r>
+        <w:t xml:space="preserve"> </w:t>
+      </w:r>
+      <w:r>
+        <w:rPr>
+          <w:rStyle w:val="VerbatimChar"/>
+        </w:rPr>
+        <w:t xml:space="preserve">main</w:t>
+      </w:r>
+      <w:r>
+        <w:t xml:space="preserve">. Its CI also smoke-tests the container with a Railway-style</w:t>
+      </w:r>
+      <w:r>
+        <w:t xml:space="preserve"> </w:t>
+      </w:r>
+      <w:r>
+        <w:rPr>
+          <w:rStyle w:val="VerbatimChar"/>
+        </w:rPr>
+        <w:t xml:space="preserve">PORT</w:t>
+      </w:r>
+      <w:r>
+        <w:t xml:space="preserve"> </w:t>
+      </w:r>
+      <w:r>
+        <w:t xml:space="preserve">variable.</w:t>
       </w:r>
     </w:p>
     <w:p>
@@ -6168,286 +6229,153 @@
           <w:bCs/>
           <w:b/>
         </w:rPr>
-        <w:t xml:space="preserve">Metrics (</w:t>
-      </w:r>
-      <w:r>
-        <w:rPr>
-          <w:rStyle w:val="VerbatimChar"/>
+        <w:t xml:space="preserve">Port.</w:t>
+      </w:r>
+      <w:r>
+        <w:t xml:space="preserve"> </w:t>
+      </w:r>
+      <w:r>
+        <w:t xml:space="preserve">The Dockerfile listens on</w:t>
+      </w:r>
+      <w:r>
+        <w:t xml:space="preserve"> </w:t>
+      </w:r>
+      <w:r>
+        <w:rPr>
+          <w:rStyle w:val="VerbatimChar"/>
+        </w:rPr>
+        <w:t xml:space="preserve">${PORT:-8000}</w:t>
+      </w:r>
+      <w:r>
+        <w:t xml:space="preserve">, so one image works on Railway, Docker and Kubernetes.</w:t>
+      </w:r>
+    </w:p>
+    <w:p>
+      <w:pPr>
+        <w:numPr>
+          <w:ilvl w:val="0"/>
+          <w:numId w:val="1017"/>
+        </w:numPr>
+        <w:pStyle w:val="Compact"/>
+      </w:pPr>
+      <w:r>
+        <w:rPr>
           <w:bCs/>
           <w:b/>
         </w:rPr>
-        <w:t xml:space="preserve">prometheus_client</w:t>
-      </w:r>
+        <w:t xml:space="preserve">Web UI.</w:t>
+      </w:r>
+      <w:r>
+        <w:t xml:space="preserve"> </w:t>
+      </w:r>
+      <w:r>
+        <w:t xml:space="preserve">The UI at</w:t>
+      </w:r>
+      <w:r>
+        <w:t xml:space="preserve"> </w:t>
+      </w:r>
+      <w:r>
+        <w:rPr>
+          <w:rStyle w:val="VerbatimChar"/>
+        </w:rPr>
+        <w:t xml:space="preserve">/</w:t>
+      </w:r>
+      <w:r>
+        <w:t xml:space="preserve"> </w:t>
+      </w:r>
+      <w:r>
+        <w:t xml:space="preserve">is a form for entering a new patient. Its sections are demographics, symptoms and vitals, ECG and exercise test, and optional imaging fields. It sends the input to</w:t>
+      </w:r>
+      <w:r>
+        <w:t xml:space="preserve"> </w:t>
+      </w:r>
+      <w:r>
+        <w:rPr>
+          <w:rStyle w:val="VerbatimChar"/>
+        </w:rPr>
+        <w:t xml:space="preserve">/predict</w:t>
+      </w:r>
+      <w:r>
+        <w:t xml:space="preserve">, then shows:</w:t>
+      </w:r>
+    </w:p>
+    <w:p>
+      <w:pPr>
+        <w:numPr>
+          <w:ilvl w:val="1"/>
+          <w:numId w:val="1018"/>
+        </w:numPr>
+        <w:pStyle w:val="Compact"/>
+      </w:pPr>
+      <w:r>
+        <w:t xml:space="preserve">the probability of disease on a low / moderate / high risk meter</w:t>
+      </w:r>
+    </w:p>
+    <w:p>
+      <w:pPr>
+        <w:numPr>
+          <w:ilvl w:val="1"/>
+          <w:numId w:val="1018"/>
+        </w:numPr>
+        <w:pStyle w:val="Compact"/>
+      </w:pPr>
+      <w:r>
+        <w:t xml:space="preserve">the predicted class and the model’s confidence</w:t>
+      </w:r>
+    </w:p>
+    <w:p>
+      <w:pPr>
+        <w:numPr>
+          <w:ilvl w:val="1"/>
+          <w:numId w:val="1018"/>
+        </w:numPr>
+        <w:pStyle w:val="Compact"/>
+      </w:pPr>
+      <w:r>
+        <w:t xml:space="preserve">the history of predictions made in the session</w:t>
+      </w:r>
+    </w:p>
+    <w:p>
+      <w:pPr>
+        <w:numPr>
+          <w:ilvl w:val="0"/>
+          <w:numId w:val="1000"/>
+        </w:numPr>
+        <w:pStyle w:val="Compact"/>
+      </w:pPr>
+      <w:r>
+        <w:t xml:space="preserve">The browser checks the inputs, and the API checks them again (HTTP 422 for invalid input).</w:t>
+      </w:r>
+    </w:p>
+    <w:p>
+      <w:pPr>
+        <w:numPr>
+          <w:ilvl w:val="0"/>
+          <w:numId w:val="1017"/>
+        </w:numPr>
+        <w:pStyle w:val="Compact"/>
+      </w:pPr>
       <w:r>
         <w:rPr>
           <w:bCs/>
           <w:b/>
         </w:rPr>
-        <w:t xml:space="preserve">):</w:t>
-      </w:r>
-    </w:p>
-    <w:p>
-      <w:pPr>
-        <w:numPr>
-          <w:ilvl w:val="1"/>
-          <w:numId w:val="1018"/>
-        </w:numPr>
-        <w:pStyle w:val="Compact"/>
-      </w:pPr>
-      <w:r>
-        <w:rPr>
-          <w:rStyle w:val="VerbatimChar"/>
-        </w:rPr>
-        <w:t xml:space="preserve">heart_api_requests_total{method,path,status}</w:t>
-      </w:r>
-    </w:p>
-    <w:p>
-      <w:pPr>
-        <w:numPr>
-          <w:ilvl w:val="1"/>
-          <w:numId w:val="1018"/>
-        </w:numPr>
-        <w:pStyle w:val="Compact"/>
-      </w:pPr>
-      <w:r>
-        <w:rPr>
-          <w:rStyle w:val="VerbatimChar"/>
-        </w:rPr>
-        <w:t xml:space="preserve">heart_api_request_latency_seconds</w:t>
-      </w:r>
-      <w:r>
-        <w:t xml:space="preserve"> </w:t>
-      </w:r>
-      <w:r>
-        <w:t xml:space="preserve">(histogram)</w:t>
-      </w:r>
-    </w:p>
-    <w:p>
-      <w:pPr>
-        <w:numPr>
-          <w:ilvl w:val="1"/>
-          <w:numId w:val="1018"/>
-        </w:numPr>
-        <w:pStyle w:val="Compact"/>
-      </w:pPr>
-      <w:r>
-        <w:rPr>
-          <w:rStyle w:val="VerbatimChar"/>
-        </w:rPr>
-        <w:t xml:space="preserve">heart_api_predictions_total{label,risk_band}</w:t>
-      </w:r>
-    </w:p>
-    <w:p>
-      <w:pPr>
-        <w:numPr>
-          <w:ilvl w:val="1"/>
-          <w:numId w:val="1018"/>
-        </w:numPr>
-        <w:pStyle w:val="Compact"/>
-      </w:pPr>
-      <w:r>
-        <w:rPr>
-          <w:rStyle w:val="VerbatimChar"/>
-        </w:rPr>
-        <w:t xml:space="preserve">heart_api_predicted_probability</w:t>
-      </w:r>
-      <w:r>
-        <w:t xml:space="preserve"> </w:t>
-      </w:r>
-      <w:r>
-        <w:t xml:space="preserve">(histogram)</w:t>
-      </w:r>
-    </w:p>
-    <w:p>
-      <w:pPr>
-        <w:numPr>
-          <w:ilvl w:val="1"/>
-          <w:numId w:val="1018"/>
-        </w:numPr>
-        <w:pStyle w:val="Compact"/>
-      </w:pPr>
-      <w:r>
-        <w:rPr>
-          <w:rStyle w:val="VerbatimChar"/>
-        </w:rPr>
-        <w:t xml:space="preserve">heart_api_model_loaded</w:t>
-      </w:r>
-    </w:p>
-    <w:p>
-      <w:pPr>
-        <w:numPr>
-          <w:ilvl w:val="0"/>
-          <w:numId w:val="1000"/>
-        </w:numPr>
-        <w:pStyle w:val="Compact"/>
-      </w:pPr>
-      <w:r>
-        <w:t xml:space="preserve">The probability histogram and the class mix are simple</w:t>
-      </w:r>
-      <w:r>
-        <w:t xml:space="preserve"> </w:t>
-      </w:r>
-      <w:r>
-        <w:rPr>
-          <w:bCs/>
-          <w:b/>
-        </w:rPr>
-        <w:t xml:space="preserve">model-behaviour monitors</w:t>
-      </w:r>
-      <w:r>
-        <w:t xml:space="preserve">. A sudden shift in the disease-positive share is an early warning of data drift.</w:t>
-      </w:r>
-    </w:p>
-    <w:p>
-      <w:pPr>
-        <w:numPr>
-          <w:ilvl w:val="0"/>
-          <w:numId w:val="1017"/>
-        </w:numPr>
-        <w:pStyle w:val="Compact"/>
-      </w:pPr>
-      <w:r>
-        <w:rPr>
-          <w:bCs/>
-          <w:b/>
-        </w:rPr>
-        <w:t xml:space="preserve">Prometheus</w:t>
-      </w:r>
-      <w:r>
-        <w:t xml:space="preserve"> </w:t>
-      </w:r>
-      <w:r>
-        <w:t xml:space="preserve">discovers each pod and scrapes it every 5 seconds. It has three alert rules: API down, 5xx rate above 5 %, and p95 latency above 500 ms.</w:t>
-      </w:r>
-    </w:p>
-    <w:p>
-      <w:pPr>
-        <w:numPr>
-          <w:ilvl w:val="0"/>
-          <w:numId w:val="1017"/>
-        </w:numPr>
-        <w:pStyle w:val="Compact"/>
-      </w:pPr>
-      <w:r>
-        <w:rPr>
-          <w:bCs/>
-          <w:b/>
-        </w:rPr>
-        <w:t xml:space="preserve">Grafana</w:t>
-      </w:r>
-      <w:r>
-        <w:t xml:space="preserve"> </w:t>
-      </w:r>
-      <w:r>
-        <w:t xml:space="preserve">is provisioned as code, with the datasource and dashboard JSON in ConfigMaps. The dashboard shows:</w:t>
-      </w:r>
-    </w:p>
-    <w:p>
-      <w:pPr>
-        <w:numPr>
-          <w:ilvl w:val="1"/>
-          <w:numId w:val="1019"/>
-        </w:numPr>
-        <w:pStyle w:val="Compact"/>
-      </w:pPr>
-      <w:r>
-        <w:t xml:space="preserve">request totals</w:t>
-      </w:r>
-    </w:p>
-    <w:p>
-      <w:pPr>
-        <w:numPr>
-          <w:ilvl w:val="1"/>
-          <w:numId w:val="1019"/>
-        </w:numPr>
-        <w:pStyle w:val="Compact"/>
-      </w:pPr>
-      <w:r>
-        <w:t xml:space="preserve">predictions served</w:t>
-      </w:r>
-    </w:p>
-    <w:p>
-      <w:pPr>
-        <w:numPr>
-          <w:ilvl w:val="1"/>
-          <w:numId w:val="1019"/>
-        </w:numPr>
-        <w:pStyle w:val="Compact"/>
-      </w:pPr>
-      <w:r>
-        <w:t xml:space="preserve">disease-positive share</w:t>
-      </w:r>
-    </w:p>
-    <w:p>
-      <w:pPr>
-        <w:numPr>
-          <w:ilvl w:val="1"/>
-          <w:numId w:val="1019"/>
-        </w:numPr>
-        <w:pStyle w:val="Compact"/>
-      </w:pPr>
-      <w:r>
-        <w:t xml:space="preserve">pods with the model loaded</w:t>
-      </w:r>
-    </w:p>
-    <w:p>
-      <w:pPr>
-        <w:numPr>
-          <w:ilvl w:val="1"/>
-          <w:numId w:val="1019"/>
-        </w:numPr>
-        <w:pStyle w:val="Compact"/>
-      </w:pPr>
-      <w:r>
-        <w:t xml:space="preserve">request rate per endpoint</w:t>
-      </w:r>
-    </w:p>
-    <w:p>
-      <w:pPr>
-        <w:numPr>
-          <w:ilvl w:val="1"/>
-          <w:numId w:val="1019"/>
-        </w:numPr>
-        <w:pStyle w:val="Compact"/>
-      </w:pPr>
-      <w:r>
-        <w:t xml:space="preserve">p50/p95 latency</w:t>
-      </w:r>
-    </w:p>
-    <w:p>
-      <w:pPr>
-        <w:numPr>
-          <w:ilvl w:val="1"/>
-          <w:numId w:val="1019"/>
-        </w:numPr>
-        <w:pStyle w:val="Compact"/>
-      </w:pPr>
-      <w:r>
-        <w:t xml:space="preserve">predictions per risk band</w:t>
-      </w:r>
-    </w:p>
-    <w:p>
-      <w:pPr>
-        <w:numPr>
-          <w:ilvl w:val="1"/>
-          <w:numId w:val="1019"/>
-        </w:numPr>
-        <w:pStyle w:val="Compact"/>
-      </w:pPr>
-      <w:r>
-        <w:t xml:space="preserve">HTTP status codes</w:t>
-      </w:r>
-    </w:p>
-    <w:p>
-      <w:pPr>
-        <w:numPr>
-          <w:ilvl w:val="1"/>
-          <w:numId w:val="1019"/>
-        </w:numPr>
-        <w:pStyle w:val="Compact"/>
-      </w:pPr>
-      <w:r>
-        <w:t xml:space="preserve">the distribution of predicted probabilities</w:t>
+        <w:t xml:space="preserve">Custom domain.</w:t>
+      </w:r>
+      <w:r>
+        <w:t xml:space="preserve"> </w:t>
+      </w:r>
+      <w:r>
+        <w:rPr>
+          <w:rStyle w:val="VerbatimChar"/>
+        </w:rPr>
+        <w:t xml:space="preserve">heart.jpailabs.tech</w:t>
+      </w:r>
+      <w:r>
+        <w:t xml:space="preserve"> </w:t>
+      </w:r>
+      <w:r>
+        <w:t xml:space="preserve">is a CNAME record in Hostinger DNS pointing to Railway’s edge, plus a TXT record that proves ownership of the domain. Railway issues the Let’s Encrypt certificate automatically.</w:t>
       </w:r>
     </w:p>
     <w:p>
@@ -6457,20 +6385,75 @@
       <w:r>
         <w:drawing>
           <wp:inline>
-            <wp:extent cx="5334000" cy="1112283"/>
+            <wp:extent cx="5334000" cy="4373880"/>
             <wp:effectExtent b="0" l="0" r="0" t="0"/>
-            <wp:docPr descr="API request logs (JSON)" title="" id="1" name="Picture"/>
+            <wp:docPr descr="Live web UI at heart.jpailabs.tech" title="" id="1" name="Picture"/>
             <a:graphic>
               <a:graphicData uri="http://schemas.openxmlformats.org/drawingml/2006/picture">
                 <pic:pic>
                   <pic:nvPicPr>
-                    <pic:cNvPr descr="../screenshots/18_k8s_api_request_logs.png" id="0" name="Picture"/>
+                    <pic:cNvPr descr="../screenshots/21_railway_live_web_ui.png" id="0" name="Picture"/>
                     <pic:cNvPicPr>
                       <a:picLocks noChangeArrowheads="1" noChangeAspect="1"/>
                     </pic:cNvPicPr>
                   </pic:nvPicPr>
                   <pic:blipFill>
-                    <a:blip r:embed="rId52"/>
+                    <a:blip r:embed="rId53"/>
+                    <a:stretch>
+                      <a:fillRect/>
+                    </a:stretch>
+                  </pic:blipFill>
+                  <pic:spPr bwMode="auto">
+                    <a:xfrm>
+                      <a:off x="0" y="0"/>
+                      <a:ext cx="5334000" cy="4373880"/>
+                    </a:xfrm>
+                    <a:prstGeom prst="rect">
+                      <a:avLst/>
+                    </a:prstGeom>
+                    <a:noFill/>
+                    <a:ln w="9525">
+                      <a:noFill/>
+                      <a:headEnd/>
+                      <a:tailEnd/>
+                    </a:ln>
+                  </pic:spPr>
+                </pic:pic>
+              </a:graphicData>
+            </a:graphic>
+          </wp:inline>
+        </w:drawing>
+      </w:r>
+    </w:p>
+    <w:p>
+      <w:pPr>
+        <w:pStyle w:val="ImageCaption"/>
+      </w:pPr>
+      <w:r>
+        <w:t xml:space="preserve">Live web UI at heart.jpailabs.tech</w:t>
+      </w:r>
+    </w:p>
+    <w:p>
+      <w:pPr>
+        <w:pStyle w:val="CaptionedFigure"/>
+      </w:pPr>
+      <w:r>
+        <w:drawing>
+          <wp:inline>
+            <wp:extent cx="5334000" cy="1112283"/>
+            <wp:effectExtent b="0" l="0" r="0" t="0"/>
+            <wp:docPr descr="Live endpoint checks: DNS, TLS, /ready, /predict, validation, /model-info" title="" id="1" name="Picture"/>
+            <a:graphic>
+              <a:graphicData uri="http://schemas.openxmlformats.org/drawingml/2006/picture">
+                <pic:pic>
+                  <pic:nvPicPr>
+                    <pic:cNvPr descr="../screenshots/22_railway_live_api_checks.png" id="0" name="Picture"/>
+                    <pic:cNvPicPr>
+                      <a:picLocks noChangeArrowheads="1" noChangeAspect="1"/>
+                    </pic:cNvPicPr>
+                  </pic:nvPicPr>
+                  <pic:blipFill>
+                    <a:blip r:embed="rId54"/>
                     <a:stretch>
                       <a:fillRect/>
                     </a:stretch>
@@ -6502,6 +6485,428 @@
         <w:pStyle w:val="ImageCaption"/>
       </w:pPr>
       <w:r>
+        <w:t xml:space="preserve">Live endpoint checks: DNS, TLS, /ready, /predict, validation, /model-info</w:t>
+      </w:r>
+    </w:p>
+    <w:bookmarkEnd w:id="55"/>
+    <w:bookmarkEnd w:id="56"/>
+    <w:bookmarkStart w:id="60" w:name="monitoring-and-logging"/>
+    <w:p>
+      <w:pPr>
+        <w:pStyle w:val="Heading1"/>
+      </w:pPr>
+      <w:r>
+        <w:t xml:space="preserve">11. Monitoring and logging</w:t>
+      </w:r>
+    </w:p>
+    <w:p>
+      <w:pPr>
+        <w:numPr>
+          <w:ilvl w:val="0"/>
+          <w:numId w:val="1019"/>
+        </w:numPr>
+        <w:pStyle w:val="Compact"/>
+      </w:pPr>
+      <w:r>
+        <w:rPr>
+          <w:bCs/>
+          <w:b/>
+        </w:rPr>
+        <w:t xml:space="preserve">Request logging.</w:t>
+      </w:r>
+      <w:r>
+        <w:t xml:space="preserve"> </w:t>
+      </w:r>
+      <w:r>
+        <w:t xml:space="preserve">HTTP middleware writes one JSON line per request to stdout, with</w:t>
+      </w:r>
+      <w:r>
+        <w:t xml:space="preserve"> </w:t>
+      </w:r>
+      <w:r>
+        <w:rPr>
+          <w:rStyle w:val="VerbatimChar"/>
+        </w:rPr>
+        <w:t xml:space="preserve">request_id</w:t>
+      </w:r>
+      <w:r>
+        <w:t xml:space="preserve">, method, path, status, latency and client IP. The request id is also returned in the</w:t>
+      </w:r>
+      <w:r>
+        <w:t xml:space="preserve"> </w:t>
+      </w:r>
+      <w:r>
+        <w:rPr>
+          <w:rStyle w:val="VerbatimChar"/>
+        </w:rPr>
+        <w:t xml:space="preserve">x-request-id</w:t>
+      </w:r>
+      <w:r>
+        <w:t xml:space="preserve"> </w:t>
+      </w:r>
+      <w:r>
+        <w:t xml:space="preserve">header. Each prediction is logged with its input and output, which gives an audit trail and data for later drift analysis. Kubernetes collects these logs with</w:t>
+      </w:r>
+      <w:r>
+        <w:t xml:space="preserve"> </w:t>
+      </w:r>
+      <w:r>
+        <w:rPr>
+          <w:rStyle w:val="VerbatimChar"/>
+        </w:rPr>
+        <w:t xml:space="preserve">kubectl logs</w:t>
+      </w:r>
+      <w:r>
+        <w:t xml:space="preserve">.</w:t>
+      </w:r>
+    </w:p>
+    <w:p>
+      <w:pPr>
+        <w:numPr>
+          <w:ilvl w:val="0"/>
+          <w:numId w:val="1019"/>
+        </w:numPr>
+        <w:pStyle w:val="Compact"/>
+      </w:pPr>
+      <w:r>
+        <w:rPr>
+          <w:bCs/>
+          <w:b/>
+        </w:rPr>
+        <w:t xml:space="preserve">Metrics (</w:t>
+      </w:r>
+      <w:r>
+        <w:rPr>
+          <w:rStyle w:val="VerbatimChar"/>
+          <w:bCs/>
+          <w:b/>
+        </w:rPr>
+        <w:t xml:space="preserve">prometheus_client</w:t>
+      </w:r>
+      <w:r>
+        <w:rPr>
+          <w:bCs/>
+          <w:b/>
+        </w:rPr>
+        <w:t xml:space="preserve">):</w:t>
+      </w:r>
+    </w:p>
+    <w:p>
+      <w:pPr>
+        <w:numPr>
+          <w:ilvl w:val="1"/>
+          <w:numId w:val="1020"/>
+        </w:numPr>
+        <w:pStyle w:val="Compact"/>
+      </w:pPr>
+      <w:r>
+        <w:rPr>
+          <w:rStyle w:val="VerbatimChar"/>
+        </w:rPr>
+        <w:t xml:space="preserve">heart_api_requests_total{method,path,status}</w:t>
+      </w:r>
+    </w:p>
+    <w:p>
+      <w:pPr>
+        <w:numPr>
+          <w:ilvl w:val="1"/>
+          <w:numId w:val="1020"/>
+        </w:numPr>
+        <w:pStyle w:val="Compact"/>
+      </w:pPr>
+      <w:r>
+        <w:rPr>
+          <w:rStyle w:val="VerbatimChar"/>
+        </w:rPr>
+        <w:t xml:space="preserve">heart_api_request_latency_seconds</w:t>
+      </w:r>
+      <w:r>
+        <w:t xml:space="preserve"> </w:t>
+      </w:r>
+      <w:r>
+        <w:t xml:space="preserve">(histogram)</w:t>
+      </w:r>
+    </w:p>
+    <w:p>
+      <w:pPr>
+        <w:numPr>
+          <w:ilvl w:val="1"/>
+          <w:numId w:val="1020"/>
+        </w:numPr>
+        <w:pStyle w:val="Compact"/>
+      </w:pPr>
+      <w:r>
+        <w:rPr>
+          <w:rStyle w:val="VerbatimChar"/>
+        </w:rPr>
+        <w:t xml:space="preserve">heart_api_predictions_total{label,risk_band}</w:t>
+      </w:r>
+    </w:p>
+    <w:p>
+      <w:pPr>
+        <w:numPr>
+          <w:ilvl w:val="1"/>
+          <w:numId w:val="1020"/>
+        </w:numPr>
+        <w:pStyle w:val="Compact"/>
+      </w:pPr>
+      <w:r>
+        <w:rPr>
+          <w:rStyle w:val="VerbatimChar"/>
+        </w:rPr>
+        <w:t xml:space="preserve">heart_api_predicted_probability</w:t>
+      </w:r>
+      <w:r>
+        <w:t xml:space="preserve"> </w:t>
+      </w:r>
+      <w:r>
+        <w:t xml:space="preserve">(histogram)</w:t>
+      </w:r>
+    </w:p>
+    <w:p>
+      <w:pPr>
+        <w:numPr>
+          <w:ilvl w:val="1"/>
+          <w:numId w:val="1020"/>
+        </w:numPr>
+        <w:pStyle w:val="Compact"/>
+      </w:pPr>
+      <w:r>
+        <w:rPr>
+          <w:rStyle w:val="VerbatimChar"/>
+        </w:rPr>
+        <w:t xml:space="preserve">heart_api_model_loaded</w:t>
+      </w:r>
+    </w:p>
+    <w:p>
+      <w:pPr>
+        <w:numPr>
+          <w:ilvl w:val="0"/>
+          <w:numId w:val="1000"/>
+        </w:numPr>
+        <w:pStyle w:val="Compact"/>
+      </w:pPr>
+      <w:r>
+        <w:t xml:space="preserve">The probability histogram and the class mix are simple</w:t>
+      </w:r>
+      <w:r>
+        <w:t xml:space="preserve"> </w:t>
+      </w:r>
+      <w:r>
+        <w:rPr>
+          <w:bCs/>
+          <w:b/>
+        </w:rPr>
+        <w:t xml:space="preserve">model-behaviour monitors</w:t>
+      </w:r>
+      <w:r>
+        <w:t xml:space="preserve">. A sudden shift in the disease-positive share is an early warning of data drift.</w:t>
+      </w:r>
+    </w:p>
+    <w:p>
+      <w:pPr>
+        <w:numPr>
+          <w:ilvl w:val="0"/>
+          <w:numId w:val="1019"/>
+        </w:numPr>
+        <w:pStyle w:val="Compact"/>
+      </w:pPr>
+      <w:r>
+        <w:rPr>
+          <w:bCs/>
+          <w:b/>
+        </w:rPr>
+        <w:t xml:space="preserve">Prometheus</w:t>
+      </w:r>
+      <w:r>
+        <w:t xml:space="preserve"> </w:t>
+      </w:r>
+      <w:r>
+        <w:t xml:space="preserve">discovers each pod and scrapes it every 5 seconds. It has three alert rules: API down, 5xx rate above 5 %, and p95 latency above 500 ms.</w:t>
+      </w:r>
+    </w:p>
+    <w:p>
+      <w:pPr>
+        <w:numPr>
+          <w:ilvl w:val="0"/>
+          <w:numId w:val="1019"/>
+        </w:numPr>
+        <w:pStyle w:val="Compact"/>
+      </w:pPr>
+      <w:r>
+        <w:rPr>
+          <w:bCs/>
+          <w:b/>
+        </w:rPr>
+        <w:t xml:space="preserve">Grafana</w:t>
+      </w:r>
+      <w:r>
+        <w:t xml:space="preserve"> </w:t>
+      </w:r>
+      <w:r>
+        <w:t xml:space="preserve">is provisioned as code, with the datasource and dashboard JSON in ConfigMaps. The dashboard shows:</w:t>
+      </w:r>
+    </w:p>
+    <w:p>
+      <w:pPr>
+        <w:numPr>
+          <w:ilvl w:val="1"/>
+          <w:numId w:val="1021"/>
+        </w:numPr>
+        <w:pStyle w:val="Compact"/>
+      </w:pPr>
+      <w:r>
+        <w:t xml:space="preserve">request totals</w:t>
+      </w:r>
+    </w:p>
+    <w:p>
+      <w:pPr>
+        <w:numPr>
+          <w:ilvl w:val="1"/>
+          <w:numId w:val="1021"/>
+        </w:numPr>
+        <w:pStyle w:val="Compact"/>
+      </w:pPr>
+      <w:r>
+        <w:t xml:space="preserve">predictions served</w:t>
+      </w:r>
+    </w:p>
+    <w:p>
+      <w:pPr>
+        <w:numPr>
+          <w:ilvl w:val="1"/>
+          <w:numId w:val="1021"/>
+        </w:numPr>
+        <w:pStyle w:val="Compact"/>
+      </w:pPr>
+      <w:r>
+        <w:t xml:space="preserve">disease-positive share</w:t>
+      </w:r>
+    </w:p>
+    <w:p>
+      <w:pPr>
+        <w:numPr>
+          <w:ilvl w:val="1"/>
+          <w:numId w:val="1021"/>
+        </w:numPr>
+        <w:pStyle w:val="Compact"/>
+      </w:pPr>
+      <w:r>
+        <w:t xml:space="preserve">pods with the model loaded</w:t>
+      </w:r>
+    </w:p>
+    <w:p>
+      <w:pPr>
+        <w:numPr>
+          <w:ilvl w:val="1"/>
+          <w:numId w:val="1021"/>
+        </w:numPr>
+        <w:pStyle w:val="Compact"/>
+      </w:pPr>
+      <w:r>
+        <w:t xml:space="preserve">request rate per endpoint</w:t>
+      </w:r>
+    </w:p>
+    <w:p>
+      <w:pPr>
+        <w:numPr>
+          <w:ilvl w:val="1"/>
+          <w:numId w:val="1021"/>
+        </w:numPr>
+        <w:pStyle w:val="Compact"/>
+      </w:pPr>
+      <w:r>
+        <w:t xml:space="preserve">p50/p95 latency</w:t>
+      </w:r>
+    </w:p>
+    <w:p>
+      <w:pPr>
+        <w:numPr>
+          <w:ilvl w:val="1"/>
+          <w:numId w:val="1021"/>
+        </w:numPr>
+        <w:pStyle w:val="Compact"/>
+      </w:pPr>
+      <w:r>
+        <w:t xml:space="preserve">predictions per risk band</w:t>
+      </w:r>
+    </w:p>
+    <w:p>
+      <w:pPr>
+        <w:numPr>
+          <w:ilvl w:val="1"/>
+          <w:numId w:val="1021"/>
+        </w:numPr>
+        <w:pStyle w:val="Compact"/>
+      </w:pPr>
+      <w:r>
+        <w:t xml:space="preserve">HTTP status codes</w:t>
+      </w:r>
+    </w:p>
+    <w:p>
+      <w:pPr>
+        <w:numPr>
+          <w:ilvl w:val="1"/>
+          <w:numId w:val="1021"/>
+        </w:numPr>
+        <w:pStyle w:val="Compact"/>
+      </w:pPr>
+      <w:r>
+        <w:t xml:space="preserve">the distribution of predicted probabilities</w:t>
+      </w:r>
+    </w:p>
+    <w:p>
+      <w:pPr>
+        <w:pStyle w:val="CaptionedFigure"/>
+      </w:pPr>
+      <w:r>
+        <w:drawing>
+          <wp:inline>
+            <wp:extent cx="5334000" cy="1112283"/>
+            <wp:effectExtent b="0" l="0" r="0" t="0"/>
+            <wp:docPr descr="API request logs (JSON)" title="" id="1" name="Picture"/>
+            <a:graphic>
+              <a:graphicData uri="http://schemas.openxmlformats.org/drawingml/2006/picture">
+                <pic:pic>
+                  <pic:nvPicPr>
+                    <pic:cNvPr descr="../screenshots/18_k8s_api_request_logs.png" id="0" name="Picture"/>
+                    <pic:cNvPicPr>
+                      <a:picLocks noChangeArrowheads="1" noChangeAspect="1"/>
+                    </pic:cNvPicPr>
+                  </pic:nvPicPr>
+                  <pic:blipFill>
+                    <a:blip r:embed="rId57"/>
+                    <a:stretch>
+                      <a:fillRect/>
+                    </a:stretch>
+                  </pic:blipFill>
+                  <pic:spPr bwMode="auto">
+                    <a:xfrm>
+                      <a:off x="0" y="0"/>
+                      <a:ext cx="5334000" cy="1112283"/>
+                    </a:xfrm>
+                    <a:prstGeom prst="rect">
+                      <a:avLst/>
+                    </a:prstGeom>
+                    <a:noFill/>
+                    <a:ln w="9525">
+                      <a:noFill/>
+                      <a:headEnd/>
+                      <a:tailEnd/>
+                    </a:ln>
+                  </pic:spPr>
+                </pic:pic>
+              </a:graphicData>
+            </a:graphic>
+          </wp:inline>
+        </w:drawing>
+      </w:r>
+    </w:p>
+    <w:p>
+      <w:pPr>
+        <w:pStyle w:val="ImageCaption"/>
+      </w:pPr>
+      <w:r>
         <w:t xml:space="preserve">API request logs (JSON)</w:t>
       </w:r>
     </w:p>
@@ -6525,7 +6930,7 @@
                     </pic:cNvPicPr>
                   </pic:nvPicPr>
                   <pic:blipFill>
-                    <a:blip r:embed="rId53"/>
+                    <a:blip r:embed="rId58"/>
                     <a:stretch>
                       <a:fillRect/>
                     </a:stretch>
@@ -6580,7 +6985,7 @@
                     </pic:cNvPicPr>
                   </pic:nvPicPr>
                   <pic:blipFill>
-                    <a:blip r:embed="rId54"/>
+                    <a:blip r:embed="rId59"/>
                     <a:stretch>
                       <a:fillRect/>
                     </a:stretch>
@@ -6615,8 +7020,8 @@
         <w:t xml:space="preserve">Grafana dashboard</w:t>
       </w:r>
     </w:p>
-    <w:bookmarkEnd w:id="55"/>
-    <w:bookmarkStart w:id="56" w:name="limitations-and-next-steps"/>
+    <w:bookmarkEnd w:id="60"/>
+    <w:bookmarkStart w:id="61" w:name="limitations-and-next-steps"/>
     <w:p>
       <w:pPr>
         <w:pStyle w:val="Heading1"/>
@@ -6629,7 +7034,7 @@
       <w:pPr>
         <w:numPr>
           <w:ilvl w:val="0"/>
-          <w:numId w:val="1020"/>
+          <w:numId w:val="1022"/>
         </w:numPr>
         <w:pStyle w:val="Compact"/>
       </w:pPr>
@@ -6641,7 +7046,7 @@
       <w:pPr>
         <w:numPr>
           <w:ilvl w:val="0"/>
-          <w:numId w:val="1020"/>
+          <w:numId w:val="1022"/>
         </w:numPr>
         <w:pStyle w:val="Compact"/>
       </w:pPr>
@@ -6668,7 +7073,7 @@
       <w:pPr>
         <w:numPr>
           <w:ilvl w:val="0"/>
-          <w:numId w:val="1020"/>
+          <w:numId w:val="1022"/>
         </w:numPr>
         <w:pStyle w:val="Compact"/>
       </w:pPr>
@@ -6695,7 +7100,7 @@
       <w:pPr>
         <w:numPr>
           <w:ilvl w:val="0"/>
-          <w:numId w:val="1020"/>
+          <w:numId w:val="1022"/>
         </w:numPr>
         <w:pStyle w:val="Compact"/>
       </w:pPr>
@@ -6703,8 +7108,8 @@
         <w:t xml:space="preserve">Add a CD stage that pushes to a container registry and deploys to a cloud cluster, with canary releases and automatic rollback on the Prometheus alerts.</w:t>
       </w:r>
     </w:p>
-    <w:bookmarkEnd w:id="56"/>
-    <w:bookmarkStart w:id="57" w:name="appendix-a-deliverables-checklist"/>
+    <w:bookmarkEnd w:id="61"/>
+    <w:bookmarkStart w:id="62" w:name="appendix-a-deliverables-checklist"/>
     <w:p>
       <w:pPr>
         <w:pStyle w:val="Heading1"/>
@@ -7021,7 +7426,7 @@
               <w:t xml:space="preserve"> </w:t>
             </w:r>
             <w:r>
-              <w:t xml:space="preserve">(21 images)</w:t>
+              <w:t xml:space="preserve">(23 images)</w:t>
             </w:r>
           </w:p>
         </w:tc>
@@ -7087,13 +7492,25 @@
               <w:jc w:val="left"/>
             </w:pPr>
             <w:r>
-              <w:t xml:space="preserve">§10 access instructions</w:t>
+              <w:t xml:space="preserve">live: https://heart.jpailabs.tech (web UI,</w:t>
+            </w:r>
+            <w:r>
+              <w:t xml:space="preserve"> </w:t>
+            </w:r>
+            <w:r>
+              <w:rPr>
+                <w:rStyle w:val="VerbatimChar"/>
+              </w:rPr>
+              <w:t xml:space="preserve">/docs</w:t>
+            </w:r>
+            <w:r>
+              <w:t xml:space="preserve">); local Kubernetes: §10</w:t>
             </w:r>
           </w:p>
         </w:tc>
       </w:tr>
     </w:tbl>
-    <w:bookmarkEnd w:id="57"/>
+    <w:bookmarkEnd w:id="62"/>
     <w:sectPr/>
   </w:body>
 </w:document>
@@ -7449,6 +7866,12 @@
     <w:abstractNumId w:val="991"/>
   </w:num>
   <w:num w:numId="1020">
+    <w:abstractNumId w:val="991"/>
+  </w:num>
+  <w:num w:numId="1021">
+    <w:abstractNumId w:val="991"/>
+  </w:num>
+  <w:num w:numId="1022">
     <w:abstractNumId w:val="991"/>
   </w:num>
 </w:numbering>

</xml_diff>